<commit_message>
Zuger Kantonsspital: weitere Stärken aus früherem Schreiben ergänzen
Co-Authored-By: Claude Opus 5.5 <noreply@anthropic.com>
Claude-Session: https://claude.ai/code/session_01Hc7onFwdUiEGTMraWXu8vk
</commit_message>
<xml_diff>
--- a/Lorik_Duhanaj_Bewerbung_Zuger_Kantonsspital.docx
+++ b/Lorik_Duhanaj_Bewerbung_Zuger_Kantonsspital.docx
@@ -153,7 +153,7 @@
         <w:rPr>
           <w:b w:val="0"/>
         </w:rPr>
-        <w:t>An der Wirtschaftsmittelschule machen mir die Fächer Wirtschaft und Recht sowie Rechnungswesen am meisten Spass, weil ich dort verstehe, wie ein Unternehmen funktioniert. Ich arbeite gerne mit Zahlen und freue mich darauf, dieses Wissen bei der Bearbeitung von Rechnungen und der Abrechnung von Fällen einzusetzen. Schon früh habe ich gerne am Computer gearbeitet und inzwischen mehrere ICDL-Advanced-Zertifikate erworben. Im Fach Deutsch konnte ich mich im Zeugnis von einer 4 auf eine 5 hocharbeiten. Mein dreiwöchiger Sprachaufenthalt in Brighton hat zudem mein Englisch gestärkt.</w:t>
+        <w:t>Schon früh habe ich grosse Freude an Tätigkeiten am Computer entwickelt und inzwischen mehrere ICDL-Advanced-Zertifikate erworben. Zusammen mit meinem Interesse an Mathematik und Wirtschaft war die Wirtschaftsmittelschule für mich die richtige Wahl. Besonders die Fächer Mathematik, Wirtschaft und Recht sowie Finanz- und Rechnungswesen bereiten mir Freude und stärken mein Verständnis für wirtschaftliche Zusammenhänge. Meine Zahlenaffinität möchte ich gerne bei der Bearbeitung von Rechnungen und der Abrechnung von Fällen einsetzen. Im Fach Deutsch konnte ich mich im Zeugnis von einer 4 auf eine 5 hocharbeiten, und mein dreiwöchiger Sprachaufenthalt in Brighton hat mein Englisch gestärkt.</w:t>
       </w:r>
     </w:p>
     <w:p>
@@ -164,7 +164,7 @@
         <w:rPr>
           <w:b w:val="0"/>
         </w:rPr>
-        <w:t>Erste praktische Erfahrung konnte ich bereits sammeln: Im Betrieb meines Vaters helfe ich aus und verwalte dort die Post. Ich bin zuverlässig, arbeite genau und gehe offen auf andere zu. Deshalb freue ich mich auch auf den Kontakt mit Patientinnen und Patienten, Mitarbeitenden und Lieferanten am Telefon, per E-Mail und am Schalter.</w:t>
+        <w:t>Erste praktische Erfahrung konnte ich bereits sammeln: Im Betrieb meines Vaters helfe ich aus und verwalte dort die Post. Ich bin zuverlässig, arbeite genau und organisiere gerne. Zudem bereitet mir der Kontakt mit Menschen verschiedener Generationen Freude. Deshalb freue ich mich auch darauf, Patientinnen und Patienten, Mitarbeitenden und Lieferanten am Telefon, per E-Mail und am Schalter Auskunft zu geben.</w:t>
       </w:r>
     </w:p>
     <w:p>
@@ -175,7 +175,7 @@
         <w:rPr>
           <w:b w:val="0"/>
         </w:rPr>
-        <w:t>Im Fussballclub bin ich seit Jahren ein Schlüsselspieler. Dort habe ich gelernt, Verantwortung zu übernehmen und im Team mit vollem Einsatz auf ein Ziel hinzuarbeiten. Beim Schach trainiere ich mein analytisches und strategisches Denken. Ich bin neugierig, packe gerne an und will ständig dazulernen. Genau diese Einstellung möchte ich in Ihr Team einbringen.</w:t>
+        <w:t>Als langjähriger Schlüsselspieler in meinem Fussballclub habe ich gelernt, Verantwortung zu übernehmen, im Team zu arbeiten und mich für gemeinsame Ziele einzusetzen. Beim Schach entwickle ich meine analytische Denkweise weiter und trainiere meine strategischen Fähigkeiten. Ich sehe mich als selbstständige, lösungsorientierte und wissbegierige Persönlichkeit mit hoher Lern- und Leistungsbereitschaft. Genau diese Einstellung möchte ich in Ihr Team einbringen.</w:t>
       </w:r>
     </w:p>
     <w:p>

</xml_diff>